<commit_message>
docs: document production infrastructure
</commit_message>
<xml_diff>
--- a/deliverables/location-service/REAL_QR_FIND_위치기반서비스_사업계획서_보안보완본.docx
+++ b/deliverables/location-service/REAL_QR_FIND_위치기반서비스_사업계획서_보안보완본.docx
@@ -2980,7 +2980,6 @@
                 <w:sz w:val="24"/>
                 <w:szCs w:val="24"/>
               </w:rPr>
-              <w:lastRenderedPageBreak/>
               <w:t>4</w:t>
             </w:r>
           </w:p>
@@ -16944,7 +16943,7 @@
                 <w:noProof/>
               </w:rPr>
               <w:drawing>
-                <wp:inline distT="0" distB="0" distL="0" distR="0" wp14:anchorId="2B9EE012" wp14:editId="0906D4EE">
+                <wp:inline distT="0" distB="0" distL="0" distR="0" wp14:anchorId="4818A985" wp14:editId="752C2A28">
                   <wp:extent cx="5827268" cy="2266696"/>
                   <wp:effectExtent l="0" t="0" r="0" b="0"/>
                   <wp:docPr id="29" name="Image"/>
@@ -17214,7 +17213,7 @@
                 <w:noProof/>
               </w:rPr>
               <w:drawing>
-                <wp:inline distT="0" distB="0" distL="0" distR="0" wp14:anchorId="66236AE3" wp14:editId="77C88667">
+                <wp:inline distT="0" distB="0" distL="0" distR="0" wp14:anchorId="3A5A2E60" wp14:editId="30B1FDCE">
                   <wp:extent cx="5638800" cy="2609850"/>
                   <wp:effectExtent l="0" t="0" r="0" b="0"/>
                   <wp:docPr id="30" name="Image"/>
@@ -23456,7 +23455,7 @@
                 <w:noProof/>
               </w:rPr>
               <w:drawing>
-                <wp:inline distT="0" distB="0" distL="0" distR="0" wp14:anchorId="62D91035" wp14:editId="3C4FA595">
+                <wp:inline distT="0" distB="0" distL="0" distR="0" wp14:anchorId="37629503" wp14:editId="5BFB7160">
                   <wp:extent cx="4711319" cy="2453894"/>
                   <wp:effectExtent l="0" t="0" r="0" b="0"/>
                   <wp:docPr id="31" name="Image"/>
@@ -23503,7 +23502,7 @@
                 <w:noProof/>
               </w:rPr>
               <w:drawing>
-                <wp:anchor distT="0" distB="0" distL="0" distR="0" simplePos="0" relativeHeight="251656192" behindDoc="0" locked="0" layoutInCell="1" allowOverlap="1" wp14:anchorId="56902749" wp14:editId="733FF368">
+                <wp:anchor distT="0" distB="0" distL="0" distR="0" simplePos="0" relativeHeight="251656192" behindDoc="0" locked="0" layoutInCell="1" allowOverlap="1" wp14:anchorId="58394F2F" wp14:editId="299F99B7">
                   <wp:simplePos x="0" y="0"/>
                   <wp:positionH relativeFrom="column">
                     <wp:align>left</wp:align>
@@ -23567,7 +23566,7 @@
                 <w:noProof/>
               </w:rPr>
               <w:drawing>
-                <wp:anchor distT="0" distB="0" distL="0" distR="0" simplePos="0" relativeHeight="251657216" behindDoc="0" locked="0" layoutInCell="1" allowOverlap="1" wp14:anchorId="7769DF74" wp14:editId="33AE5CF4">
+                <wp:anchor distT="0" distB="0" distL="0" distR="0" simplePos="0" relativeHeight="251657216" behindDoc="0" locked="0" layoutInCell="1" allowOverlap="1" wp14:anchorId="6AD8BA93" wp14:editId="177A82FB">
                   <wp:simplePos x="0" y="0"/>
                   <wp:positionH relativeFrom="column">
                     <wp:align>left</wp:align>
@@ -24111,7 +24110,7 @@
                 <w:noProof/>
               </w:rPr>
               <w:drawing>
-                <wp:inline distT="0" distB="0" distL="0" distR="0" wp14:anchorId="4330C133" wp14:editId="4070A316">
+                <wp:inline distT="0" distB="0" distL="0" distR="0" wp14:anchorId="51FF881C" wp14:editId="53158B76">
                   <wp:extent cx="6039485" cy="2962783"/>
                   <wp:effectExtent l="0" t="0" r="0" b="0"/>
                   <wp:docPr id="34" name="Image"/>
@@ -24168,7 +24167,7 @@
                 <w:noProof/>
               </w:rPr>
               <w:drawing>
-                <wp:inline distT="0" distB="0" distL="0" distR="0" wp14:anchorId="3C2D4980" wp14:editId="30698A6B">
+                <wp:inline distT="0" distB="0" distL="0" distR="0" wp14:anchorId="7C942048" wp14:editId="59A75201">
                   <wp:extent cx="3927221" cy="3100832"/>
                   <wp:effectExtent l="0" t="0" r="0" b="0"/>
                   <wp:docPr id="35" name="Image"/>
@@ -45513,7 +45512,7 @@
                 <w:noProof/>
               </w:rPr>
               <w:drawing>
-                <wp:inline distT="0" distB="0" distL="0" distR="0" wp14:anchorId="5BEFF952" wp14:editId="203C9F73">
+                <wp:inline distT="0" distB="0" distL="0" distR="0" wp14:anchorId="0301E747" wp14:editId="7B124C61">
                   <wp:extent cx="5939282" cy="3743325"/>
                   <wp:effectExtent l="0" t="0" r="0" b="0"/>
                   <wp:docPr id="36" name="Image"/>
@@ -46688,7 +46687,7 @@
                 <w:noProof/>
               </w:rPr>
               <w:drawing>
-                <wp:inline distT="0" distB="0" distL="0" distR="0" wp14:anchorId="50BDBE64" wp14:editId="1A3DE456">
+                <wp:inline distT="0" distB="0" distL="0" distR="0" wp14:anchorId="08093149" wp14:editId="63B4744A">
                   <wp:extent cx="4008120" cy="655320"/>
                   <wp:effectExtent l="0" t="0" r="0" b="0"/>
                   <wp:docPr id="37" name="Image"/>
@@ -47128,7 +47127,7 @@
                 <w:noProof/>
               </w:rPr>
               <w:drawing>
-                <wp:inline distT="0" distB="0" distL="0" distR="0" wp14:anchorId="536D8132" wp14:editId="2B023FB8">
+                <wp:inline distT="0" distB="0" distL="0" distR="0" wp14:anchorId="1CDE329F" wp14:editId="1348BB48">
                   <wp:extent cx="2161921" cy="2954909"/>
                   <wp:effectExtent l="0" t="0" r="0" b="0"/>
                   <wp:docPr id="38" name="Image"/>
@@ -47166,7 +47165,7 @@
                 <w:noProof/>
               </w:rPr>
               <w:drawing>
-                <wp:inline distT="0" distB="0" distL="0" distR="0" wp14:anchorId="1053468B" wp14:editId="65C60E06">
+                <wp:inline distT="0" distB="0" distL="0" distR="0" wp14:anchorId="68457180" wp14:editId="4B202C1E">
                   <wp:extent cx="2969006" cy="2996692"/>
                   <wp:effectExtent l="0" t="0" r="0" b="0"/>
                   <wp:docPr id="39" name="Image"/>
@@ -47808,7 +47807,7 @@
                 <w:noProof/>
               </w:rPr>
               <w:drawing>
-                <wp:anchor distT="0" distB="0" distL="0" distR="0" simplePos="0" relativeHeight="251658240" behindDoc="0" locked="0" layoutInCell="1" allowOverlap="1" wp14:anchorId="7A14D99D" wp14:editId="0CED4949">
+                <wp:anchor distT="0" distB="0" distL="0" distR="0" simplePos="0" relativeHeight="251658240" behindDoc="0" locked="0" layoutInCell="1" allowOverlap="1" wp14:anchorId="2C4954F7" wp14:editId="144D47F2">
                   <wp:simplePos x="0" y="0"/>
                   <wp:positionH relativeFrom="column">
                     <wp:align>left</wp:align>
@@ -48296,7 +48295,7 @@
                 <w:noProof/>
               </w:rPr>
               <w:drawing>
-                <wp:anchor distT="0" distB="0" distL="0" distR="0" simplePos="0" relativeHeight="251659264" behindDoc="0" locked="0" layoutInCell="1" allowOverlap="1" wp14:anchorId="062122B5" wp14:editId="403D1B2C">
+                <wp:anchor distT="0" distB="0" distL="0" distR="0" simplePos="0" relativeHeight="251659264" behindDoc="0" locked="0" layoutInCell="1" allowOverlap="1" wp14:anchorId="73CDDBF0" wp14:editId="3B7B7BE7">
                   <wp:simplePos x="0" y="0"/>
                   <wp:positionH relativeFrom="column">
                     <wp:align>left</wp:align>
@@ -49151,7 +49150,7 @@
                 <w:noProof/>
               </w:rPr>
               <w:drawing>
-                <wp:inline distT="0" distB="0" distL="0" distR="0" wp14:anchorId="03484147" wp14:editId="05FCEF8D">
+                <wp:inline distT="0" distB="0" distL="0" distR="0" wp14:anchorId="0B4D0E2F" wp14:editId="2625DC92">
                   <wp:extent cx="3395091" cy="3011043"/>
                   <wp:effectExtent l="0" t="0" r="0" b="0"/>
                   <wp:docPr id="42" name="Image"/>
@@ -49422,7 +49421,7 @@
                 <w:noProof/>
               </w:rPr>
               <w:drawing>
-                <wp:inline distT="0" distB="0" distL="0" distR="0" wp14:anchorId="537EB4E3" wp14:editId="3EEE4FEF">
+                <wp:inline distT="0" distB="0" distL="0" distR="0" wp14:anchorId="158B890F" wp14:editId="2515CAE2">
                   <wp:extent cx="5400040" cy="1100455"/>
                   <wp:effectExtent l="0" t="0" r="0" b="0"/>
                   <wp:docPr id="43" name="Image"/>
@@ -52455,7 +52454,7 @@
                 <w:noProof/>
               </w:rPr>
               <w:drawing>
-                <wp:inline distT="0" distB="0" distL="0" distR="0" wp14:anchorId="577D4875" wp14:editId="7C519907">
+                <wp:inline distT="0" distB="0" distL="0" distR="0" wp14:anchorId="5015100D" wp14:editId="5315954B">
                   <wp:extent cx="2974975" cy="2400935"/>
                   <wp:effectExtent l="0" t="0" r="0" b="0"/>
                   <wp:docPr id="44" name="Image"/>
@@ -52503,7 +52502,7 @@
                 <w:noProof/>
               </w:rPr>
               <w:drawing>
-                <wp:inline distT="0" distB="0" distL="0" distR="0" wp14:anchorId="61688A4B" wp14:editId="028E36B1">
+                <wp:inline distT="0" distB="0" distL="0" distR="0" wp14:anchorId="7E0D3E87" wp14:editId="5D24AA8A">
                   <wp:extent cx="2905506" cy="2403729"/>
                   <wp:effectExtent l="0" t="0" r="0" b="0"/>
                   <wp:docPr id="45" name="Image"/>
@@ -52563,7 +52562,7 @@
                 <w:noProof/>
               </w:rPr>
               <w:drawing>
-                <wp:inline distT="0" distB="0" distL="0" distR="0" wp14:anchorId="24D4D6CE" wp14:editId="144160A7">
+                <wp:inline distT="0" distB="0" distL="0" distR="0" wp14:anchorId="62AF66BE" wp14:editId="7E057577">
                   <wp:extent cx="2989453" cy="1804797"/>
                   <wp:effectExtent l="0" t="0" r="0" b="0"/>
                   <wp:docPr id="46" name="Image"/>
@@ -53826,7 +53825,7 @@
           <w:noProof/>
         </w:rPr>
         <w:drawing>
-          <wp:inline distT="0" distB="0" distL="0" distR="0" wp14:anchorId="2B25998C" wp14:editId="5C805025">
+          <wp:inline distT="0" distB="0" distL="0" distR="0" wp14:anchorId="32784C65" wp14:editId="4C178366">
             <wp:extent cx="5572125" cy="7924800"/>
             <wp:effectExtent l="0" t="0" r="0" b="0"/>
             <wp:docPr id="47" name="Image"/>
@@ -57828,9 +57827,8 @@
         <w:tblLook w:val="0000" w:firstRow="0" w:lastRow="0" w:firstColumn="0" w:lastColumn="0" w:noHBand="0" w:noVBand="0"/>
       </w:tblPr>
       <w:tblGrid>
-        <w:gridCol w:w="3278"/>
-        <w:gridCol w:w="3279"/>
-        <w:gridCol w:w="3279"/>
+        <w:gridCol w:w="4918"/>
+        <w:gridCol w:w="4918"/>
       </w:tblGrid>
       <w:tr>
         <w:tblPrEx>
@@ -57841,7 +57839,7 @@
         </w:tblPrEx>
         <w:tc>
           <w:tcPr>
-            <w:tcW w:w="1666" w:type="pct"/>
+            <w:tcW w:w="2500" w:type="pct"/>
             <w:shd w:val="clear" w:color="auto" w:fill="E6E6E6"/>
             <w:vAlign w:val="center"/>
           </w:tcPr>
@@ -57859,13 +57857,13 @@
                 <w:rFonts w:ascii="맑은 고딕" w:eastAsia="맑은 고딕" w:hAnsi="맑은 고딕"/>
                 <w:sz w:val="18"/>
               </w:rPr>
-              <w:t>장비항목</w:t>
+              <w:t>구분</w:t>
             </w:r>
           </w:p>
         </w:tc>
         <w:tc>
           <w:tcPr>
-            <w:tcW w:w="1667" w:type="pct"/>
+            <w:tcW w:w="2500" w:type="pct"/>
             <w:shd w:val="clear" w:color="auto" w:fill="E6E6E6"/>
             <w:vAlign w:val="center"/>
           </w:tcPr>
@@ -57883,31 +57881,7 @@
                 <w:rFonts w:ascii="맑은 고딕" w:eastAsia="맑은 고딕" w:hAnsi="맑은 고딕"/>
                 <w:sz w:val="18"/>
               </w:rPr>
-              <w:t>활용기능</w:t>
-            </w:r>
-          </w:p>
-        </w:tc>
-        <w:tc>
-          <w:tcPr>
-            <w:tcW w:w="1667" w:type="pct"/>
-            <w:shd w:val="clear" w:color="auto" w:fill="E6E6E6"/>
-            <w:vAlign w:val="center"/>
-          </w:tcPr>
-          <w:p>
-            <w:pPr>
-              <w:pStyle w:val="1"/>
-              <w:spacing w:line="240" w:lineRule="auto"/>
-              <w:rPr>
-                <w:rFonts w:ascii="맑은 고딕" w:eastAsia="맑은 고딕" w:hAnsi="맑은 고딕" w:hint="default"/>
-                <w:sz w:val="18"/>
-              </w:rPr>
-            </w:pPr>
-            <w:r>
-              <w:rPr>
-                <w:rFonts w:ascii="맑은 고딕" w:eastAsia="맑은 고딕" w:hAnsi="맑은 고딕"/>
-                <w:sz w:val="18"/>
-              </w:rPr>
-              <w:t>설치·운영장소</w:t>
+              <w:t>장비항목·현재규격·활용기능</w:t>
             </w:r>
           </w:p>
         </w:tc>
@@ -57921,7 +57895,7 @@
         </w:tblPrEx>
         <w:tc>
           <w:tcPr>
-            <w:tcW w:w="1666" w:type="pct"/>
+            <w:tcW w:w="2500" w:type="pct"/>
             <w:shd w:val="clear" w:color="auto" w:fill="auto"/>
             <w:vAlign w:val="center"/>
           </w:tcPr>
@@ -57939,13 +57913,13 @@
                 <w:rFonts w:ascii="맑은 고딕" w:eastAsia="맑은 고딕" w:hAnsi="맑은 고딕" w:hint="default"/>
                 <w:sz w:val="16"/>
               </w:rPr>
-              <w:t>Vercel CDN·웹 호스팅</w:t>
+              <w:t>1</w:t>
             </w:r>
           </w:p>
         </w:tc>
         <w:tc>
           <w:tcPr>
-            <w:tcW w:w="1667" w:type="pct"/>
+            <w:tcW w:w="2500" w:type="pct"/>
             <w:shd w:val="clear" w:color="auto" w:fill="auto"/>
             <w:vAlign w:val="center"/>
           </w:tcPr>
@@ -57963,31 +57937,7 @@
                 <w:rFonts w:ascii="맑은 고딕" w:eastAsia="맑은 고딕" w:hAnsi="맑은 고딕" w:hint="default"/>
                 <w:sz w:val="16"/>
               </w:rPr>
-              <w:t>HTTPS, PWA, 정적자원</w:t>
-            </w:r>
-          </w:p>
-        </w:tc>
-        <w:tc>
-          <w:tcPr>
-            <w:tcW w:w="1667" w:type="pct"/>
-            <w:shd w:val="clear" w:color="auto" w:fill="auto"/>
-            <w:vAlign w:val="center"/>
-          </w:tcPr>
-          <w:p>
-            <w:pPr>
-              <w:pStyle w:val="1"/>
-              <w:spacing w:line="240" w:lineRule="auto"/>
-              <w:rPr>
-                <w:rFonts w:ascii="맑은 고딕" w:eastAsia="맑은 고딕" w:hAnsi="맑은 고딕" w:hint="default"/>
-                <w:sz w:val="16"/>
-              </w:rPr>
-            </w:pPr>
-            <w:r>
-              <w:rPr>
-                <w:rFonts w:ascii="맑은 고딕" w:eastAsia="맑은 고딕" w:hAnsi="맑은 고딕" w:hint="default"/>
-                <w:sz w:val="16"/>
-              </w:rPr>
-              <w:t>Vercel 클라우드</w:t>
+              <w:t>Vercel Cloud 웹·애플리케이션 논리서버: 프로젝트 zezari, Next.js 16.3.0, Node.js 24.x, Production READY, Function iad1. 글로벌 CDN·HTTPS·PWA·SSR 및 인증·QR·결제·광고·위치공유 API 처리</w:t>
             </w:r>
           </w:p>
         </w:tc>
@@ -58001,7 +57951,7 @@
         </w:tblPrEx>
         <w:tc>
           <w:tcPr>
-            <w:tcW w:w="1666" w:type="pct"/>
+            <w:tcW w:w="2500" w:type="pct"/>
             <w:shd w:val="clear" w:color="auto" w:fill="auto"/>
             <w:vAlign w:val="center"/>
           </w:tcPr>
@@ -58019,13 +57969,13 @@
                 <w:rFonts w:ascii="맑은 고딕" w:eastAsia="맑은 고딕" w:hAnsi="맑은 고딕" w:hint="default"/>
                 <w:sz w:val="16"/>
               </w:rPr>
-              <w:t>Vercel Functions</w:t>
+              <w:t>2</w:t>
             </w:r>
           </w:p>
         </w:tc>
         <w:tc>
           <w:tcPr>
-            <w:tcW w:w="1667" w:type="pct"/>
+            <w:tcW w:w="2500" w:type="pct"/>
             <w:shd w:val="clear" w:color="auto" w:fill="auto"/>
             <w:vAlign w:val="center"/>
           </w:tcPr>
@@ -58040,41 +57990,10 @@
             </w:pPr>
             <w:r>
               <w:rPr>
-                <w:rFonts w:ascii="맑은 고딕" w:eastAsia="맑은 고딕" w:hAnsi="맑은 고딕"/>
-                <w:sz w:val="16"/>
-              </w:rPr>
-              <w:t>인증</w:t>
-            </w:r>
-            <w:r>
-              <w:rPr>
                 <w:rFonts w:ascii="맑은 고딕" w:eastAsia="맑은 고딕" w:hAnsi="맑은 고딕" w:hint="default"/>
                 <w:sz w:val="16"/>
               </w:rPr>
-              <w:t>, 위치공유 API, 암호화·파기</w:t>
-            </w:r>
-          </w:p>
-        </w:tc>
-        <w:tc>
-          <w:tcPr>
-            <w:tcW w:w="1667" w:type="pct"/>
-            <w:shd w:val="clear" w:color="auto" w:fill="auto"/>
-            <w:vAlign w:val="center"/>
-          </w:tcPr>
-          <w:p>
-            <w:pPr>
-              <w:pStyle w:val="1"/>
-              <w:spacing w:line="240" w:lineRule="auto"/>
-              <w:rPr>
-                <w:rFonts w:ascii="맑은 고딕" w:eastAsia="맑은 고딕" w:hAnsi="맑은 고딕" w:hint="default"/>
-                <w:sz w:val="16"/>
-              </w:rPr>
-            </w:pPr>
-            <w:r>
-              <w:rPr>
-                <w:rFonts w:ascii="맑은 고딕" w:eastAsia="맑은 고딕" w:hAnsi="맑은 고딕" w:hint="default"/>
-                <w:sz w:val="16"/>
-              </w:rPr>
-              <w:t>Vercel 서버리스 실행환경</w:t>
+              <w:t>Turso Cloud DB 논리서버: libSQL/SQLite 3.47.0, aws-ap-northeast-1, 스키마 37, 업무 테이블 37개, 논리용량 6.68 MB. 회원·QR·업무데이터·위치 암호문·동의·취급대장·접근기록 저장</w:t>
             </w:r>
           </w:p>
         </w:tc>
@@ -58088,7 +58007,7 @@
         </w:tblPrEx>
         <w:tc>
           <w:tcPr>
-            <w:tcW w:w="1666" w:type="pct"/>
+            <w:tcW w:w="2500" w:type="pct"/>
             <w:shd w:val="clear" w:color="auto" w:fill="auto"/>
             <w:vAlign w:val="center"/>
           </w:tcPr>
@@ -58106,13 +58025,13 @@
                 <w:rFonts w:ascii="맑은 고딕" w:eastAsia="맑은 고딕" w:hAnsi="맑은 고딕" w:hint="default"/>
                 <w:sz w:val="16"/>
               </w:rPr>
-              <w:t>Turso/libSQL</w:t>
+              <w:t>3</w:t>
             </w:r>
           </w:p>
         </w:tc>
         <w:tc>
           <w:tcPr>
-            <w:tcW w:w="1667" w:type="pct"/>
+            <w:tcW w:w="2500" w:type="pct"/>
             <w:shd w:val="clear" w:color="auto" w:fill="auto"/>
             <w:vAlign w:val="center"/>
           </w:tcPr>
@@ -58127,41 +58046,10 @@
             </w:pPr>
             <w:r>
               <w:rPr>
-                <w:rFonts w:ascii="맑은 고딕" w:eastAsia="맑은 고딕" w:hAnsi="맑은 고딕"/>
-                <w:sz w:val="16"/>
-              </w:rPr>
-              <w:t>회원·</w:t>
-            </w:r>
-            <w:r>
-              <w:rPr>
                 <w:rFonts w:ascii="맑은 고딕" w:eastAsia="맑은 고딕" w:hAnsi="맑은 고딕" w:hint="default"/>
                 <w:sz w:val="16"/>
               </w:rPr>
-              <w:t>QR·위치 암호문·취급대장·접근로그</w:t>
-            </w:r>
-          </w:p>
-        </w:tc>
-        <w:tc>
-          <w:tcPr>
-            <w:tcW w:w="1667" w:type="pct"/>
-            <w:shd w:val="clear" w:color="auto" w:fill="auto"/>
-            <w:vAlign w:val="center"/>
-          </w:tcPr>
-          <w:p>
-            <w:pPr>
-              <w:pStyle w:val="1"/>
-              <w:spacing w:line="240" w:lineRule="auto"/>
-              <w:rPr>
-                <w:rFonts w:ascii="맑은 고딕" w:eastAsia="맑은 고딕" w:hAnsi="맑은 고딕" w:hint="default"/>
-                <w:sz w:val="16"/>
-              </w:rPr>
-            </w:pPr>
-            <w:r>
-              <w:rPr>
-                <w:rFonts w:ascii="맑은 고딕" w:eastAsia="맑은 고딕" w:hAnsi="맑은 고딕" w:hint="default"/>
-                <w:sz w:val="16"/>
-              </w:rPr>
-              <w:t>Turso 클라우드</w:t>
+              <w:t>GitHub Cloud 형상·배포이력 저장소: zezariGit/zezariGit, main. 소스·변경이력·배포 기준점과 Vercel Production 자동 배포 연동, .env.local 저장소 제외</w:t>
             </w:r>
           </w:p>
         </w:tc>
@@ -58175,7 +58063,7 @@
         </w:tblPrEx>
         <w:tc>
           <w:tcPr>
-            <w:tcW w:w="1666" w:type="pct"/>
+            <w:tcW w:w="2500" w:type="pct"/>
             <w:shd w:val="clear" w:color="auto" w:fill="auto"/>
             <w:vAlign w:val="center"/>
           </w:tcPr>
@@ -58193,13 +58081,13 @@
                 <w:rFonts w:ascii="맑은 고딕" w:eastAsia="맑은 고딕" w:hAnsi="맑은 고딕" w:hint="default"/>
                 <w:sz w:val="16"/>
               </w:rPr>
-              <w:t>GitHub</w:t>
+              <w:t>4</w:t>
             </w:r>
           </w:p>
         </w:tc>
         <w:tc>
           <w:tcPr>
-            <w:tcW w:w="1667" w:type="pct"/>
+            <w:tcW w:w="2500" w:type="pct"/>
             <w:shd w:val="clear" w:color="auto" w:fill="auto"/>
             <w:vAlign w:val="center"/>
           </w:tcPr>
@@ -58217,38 +58105,14 @@
                 <w:rFonts w:ascii="맑은 고딕" w:eastAsia="맑은 고딕" w:hAnsi="맑은 고딕"/>
                 <w:sz w:val="16"/>
               </w:rPr>
-              <w:t>소스·변경·배포</w:t>
+              <w:t>관리자</w:t>
             </w:r>
             <w:r>
               <w:rPr>
                 <w:rFonts w:ascii="맑은 고딕" w:eastAsia="맑은 고딕" w:hAnsi="맑은 고딕" w:hint="default"/>
                 <w:sz w:val="16"/>
               </w:rPr>
-              <w:t xml:space="preserve"> 이력</w:t>
-            </w:r>
-          </w:p>
-        </w:tc>
-        <w:tc>
-          <w:tcPr>
-            <w:tcW w:w="1667" w:type="pct"/>
-            <w:shd w:val="clear" w:color="auto" w:fill="auto"/>
-            <w:vAlign w:val="center"/>
-          </w:tcPr>
-          <w:p>
-            <w:pPr>
-              <w:pStyle w:val="1"/>
-              <w:spacing w:line="240" w:lineRule="auto"/>
-              <w:rPr>
-                <w:rFonts w:ascii="맑은 고딕" w:eastAsia="맑은 고딕" w:hAnsi="맑은 고딕" w:hint="default"/>
-                <w:sz w:val="16"/>
-              </w:rPr>
-            </w:pPr>
-            <w:r>
-              <w:rPr>
-                <w:rFonts w:ascii="맑은 고딕" w:eastAsia="맑은 고딕" w:hAnsi="맑은 고딕" w:hint="default"/>
-                <w:sz w:val="16"/>
-              </w:rPr>
-              <w:t>GitHub 클라우드</w:t>
+              <w:t xml:space="preserve"> 업무용 PC·사업장 네트워크: 관리자 로그인, 권한·대장·민원·사고대응. 실제 모델·OS·자산번호·설치주소·백신·화면잠금 자료는 운영자 첨부</w:t>
             </w:r>
           </w:p>
         </w:tc>
@@ -58262,7 +58126,7 @@
         </w:tblPrEx>
         <w:tc>
           <w:tcPr>
-            <w:tcW w:w="1666" w:type="pct"/>
+            <w:tcW w:w="2500" w:type="pct"/>
             <w:shd w:val="clear" w:color="auto" w:fill="auto"/>
             <w:vAlign w:val="center"/>
           </w:tcPr>
@@ -58277,23 +58141,16 @@
             </w:pPr>
             <w:r>
               <w:rPr>
-                <w:rFonts w:ascii="맑은 고딕" w:eastAsia="맑은 고딕" w:hAnsi="맑은 고딕"/>
-                <w:sz w:val="16"/>
-              </w:rPr>
-              <w:t>관리자</w:t>
-            </w:r>
-            <w:r>
-              <w:rPr>
                 <w:rFonts w:ascii="맑은 고딕" w:eastAsia="맑은 고딕" w:hAnsi="맑은 고딕" w:hint="default"/>
                 <w:sz w:val="16"/>
               </w:rPr>
-              <w:t xml:space="preserve"> 업무용 PC</w:t>
+              <w:t>5</w:t>
             </w:r>
           </w:p>
         </w:tc>
         <w:tc>
           <w:tcPr>
-            <w:tcW w:w="1667" w:type="pct"/>
+            <w:tcW w:w="2500" w:type="pct"/>
             <w:shd w:val="clear" w:color="auto" w:fill="auto"/>
             <w:vAlign w:val="center"/>
           </w:tcPr>
@@ -58311,146 +58168,14 @@
                 <w:rFonts w:ascii="맑은 고딕" w:eastAsia="맑은 고딕" w:hAnsi="맑은 고딕"/>
                 <w:sz w:val="16"/>
               </w:rPr>
-              <w:t>운영·민원·보안</w:t>
+              <w:t>발견자·보호자</w:t>
             </w:r>
             <w:r>
               <w:rPr>
                 <w:rFonts w:ascii="맑은 고딕" w:eastAsia="맑은 고딕" w:hAnsi="맑은 고딕" w:hint="default"/>
                 <w:sz w:val="16"/>
               </w:rPr>
-              <w:t xml:space="preserve"> 점검</w:t>
-            </w:r>
-          </w:p>
-        </w:tc>
-        <w:tc>
-          <w:tcPr>
-            <w:tcW w:w="1667" w:type="pct"/>
-            <w:shd w:val="clear" w:color="auto" w:fill="auto"/>
-            <w:vAlign w:val="center"/>
-          </w:tcPr>
-          <w:p>
-            <w:pPr>
-              <w:pStyle w:val="1"/>
-              <w:spacing w:line="240" w:lineRule="auto"/>
-              <w:rPr>
-                <w:rFonts w:ascii="맑은 고딕" w:eastAsia="맑은 고딕" w:hAnsi="맑은 고딕" w:hint="default"/>
-                <w:sz w:val="16"/>
-              </w:rPr>
-            </w:pPr>
-            <w:r>
-              <w:rPr>
-                <w:rFonts w:ascii="맑은 고딕" w:eastAsia="맑은 고딕" w:hAnsi="맑은 고딕"/>
-                <w:sz w:val="16"/>
-              </w:rPr>
-              <w:t>사업장</w:t>
-            </w:r>
-            <w:r>
-              <w:rPr>
-                <w:rFonts w:ascii="맑은 고딕" w:eastAsia="맑은 고딕" w:hAnsi="맑은 고딕" w:hint="default"/>
-                <w:sz w:val="16"/>
-              </w:rPr>
-              <w:t xml:space="preserve"> 내 지정 단말</w:t>
-            </w:r>
-          </w:p>
-        </w:tc>
-      </w:tr>
-      <w:tr>
-        <w:tblPrEx>
-          <w:tblCellMar>
-            <w:top w:w="0" w:type="dxa"/>
-            <w:bottom w:w="0" w:type="dxa"/>
-          </w:tblCellMar>
-        </w:tblPrEx>
-        <w:tc>
-          <w:tcPr>
-            <w:tcW w:w="1666" w:type="pct"/>
-            <w:shd w:val="clear" w:color="auto" w:fill="auto"/>
-            <w:vAlign w:val="center"/>
-          </w:tcPr>
-          <w:p>
-            <w:pPr>
-              <w:pStyle w:val="1"/>
-              <w:spacing w:line="240" w:lineRule="auto"/>
-              <w:rPr>
-                <w:rFonts w:ascii="맑은 고딕" w:eastAsia="맑은 고딕" w:hAnsi="맑은 고딕" w:hint="default"/>
-                <w:sz w:val="16"/>
-              </w:rPr>
-            </w:pPr>
-            <w:r>
-              <w:rPr>
-                <w:rFonts w:ascii="맑은 고딕" w:eastAsia="맑은 고딕" w:hAnsi="맑은 고딕"/>
-                <w:sz w:val="16"/>
-              </w:rPr>
-              <w:t>사업장</w:t>
-            </w:r>
-            <w:r>
-              <w:rPr>
-                <w:rFonts w:ascii="맑은 고딕" w:eastAsia="맑은 고딕" w:hAnsi="맑은 고딕" w:hint="default"/>
-                <w:sz w:val="16"/>
-              </w:rPr>
-              <w:t xml:space="preserve"> 네트워크</w:t>
-            </w:r>
-          </w:p>
-        </w:tc>
-        <w:tc>
-          <w:tcPr>
-            <w:tcW w:w="1667" w:type="pct"/>
-            <w:shd w:val="clear" w:color="auto" w:fill="auto"/>
-            <w:vAlign w:val="center"/>
-          </w:tcPr>
-          <w:p>
-            <w:pPr>
-              <w:pStyle w:val="1"/>
-              <w:spacing w:line="240" w:lineRule="auto"/>
-              <w:rPr>
-                <w:rFonts w:ascii="맑은 고딕" w:eastAsia="맑은 고딕" w:hAnsi="맑은 고딕" w:hint="default"/>
-                <w:sz w:val="16"/>
-              </w:rPr>
-            </w:pPr>
-            <w:r>
-              <w:rPr>
-                <w:rFonts w:ascii="맑은 고딕" w:eastAsia="맑은 고딕" w:hAnsi="맑은 고딕"/>
-                <w:sz w:val="16"/>
-              </w:rPr>
-              <w:t>관리자</w:t>
-            </w:r>
-            <w:r>
-              <w:rPr>
-                <w:rFonts w:ascii="맑은 고딕" w:eastAsia="맑은 고딕" w:hAnsi="맑은 고딕" w:hint="default"/>
-                <w:sz w:val="16"/>
-              </w:rPr>
-              <w:t xml:space="preserve"> 인터넷 접속</w:t>
-            </w:r>
-          </w:p>
-        </w:tc>
-        <w:tc>
-          <w:tcPr>
-            <w:tcW w:w="1667" w:type="pct"/>
-            <w:shd w:val="clear" w:color="auto" w:fill="auto"/>
-            <w:vAlign w:val="center"/>
-          </w:tcPr>
-          <w:p>
-            <w:pPr>
-              <w:pStyle w:val="1"/>
-              <w:spacing w:line="240" w:lineRule="auto"/>
-              <w:rPr>
-                <w:rFonts w:ascii="맑은 고딕" w:eastAsia="맑은 고딕" w:hAnsi="맑은 고딕" w:hint="default"/>
-                <w:sz w:val="16"/>
-              </w:rPr>
-            </w:pPr>
-            <w:r>
-              <w:rPr>
-                <w:rFonts w:ascii="맑은 고딕" w:eastAsia="맑은 고딕" w:hAnsi="맑은 고딕"/>
-                <w:sz w:val="16"/>
-              </w:rPr>
-              <w:t>사업장</w:t>
-            </w:r>
-            <w:r>
-              <w:rPr>
-                <w:rFonts w:ascii="맑은 고딕" w:eastAsia="맑은 고딕" w:hAnsi="맑은 고딕" w:hint="default"/>
-                <w:sz w:val="16"/>
-              </w:rPr>
-              <w:t xml:space="preserve"> 내 네트워크 장비</w:t>
+              <w:t xml:space="preserve"> 스마트폰: QR 스캔, 단발성 GPS 위치 산출, Web Push 수신. 회사 보유 설비가 아닌 이용자 소유 외부 단말</w:t>
             </w:r>
           </w:p>
         </w:tc>
@@ -58493,25 +58218,25 @@
         <w:rPr>
           <w:rFonts w:ascii="맑은 고딕" w:eastAsia="맑은 고딕" w:hAnsi="맑은 고딕"/>
         </w:rPr>
-        <w:t>클라우드</w:t>
+        <w:t>자체</w:t>
       </w:r>
       <w:r>
         <w:rPr>
           <w:rFonts w:ascii="맑은 고딕" w:eastAsia="맑은 고딕" w:hAnsi="맑은 고딕" w:hint="default"/>
         </w:rPr>
-        <w:t xml:space="preserve"> 장비는 Vercel 및 Turso가 운영하는 데이터센터에 설치된다. 제출 시 Vercel 프로젝트·도메인·기능·Invoice, Turso 데이터베이스·리전·백업·Invoice, GitHub 저장소 권한 화면을 첨부한다. 별도 IDC 계약서가 없으면 서비스 제공자명과 이용 중인 기능이 확인되는 계정정보·청구 화면으로 대체한다. 관리자 PC와 네트워크 장비는 사업장 주소, 장비 사진, 백신 실시간 감시, 최근 업데이트일, OS 자동업데이트와 화면잠</w:t>
+        <w:t xml:space="preserve"> 물리 서버는 없고 Vercel·Turso·GitHub 관리형 클라우드의 논리설비를 사용한다. 현재 Vercel Function은 iad1(Washington, D.C., USA), Turso DB는 aws-ap-northeast-1(Tokyo, Japan)이다. 국외 처리·이전 고지와 서버·DB 리전 정렬 여부를 검토한다. 제출 시 Vercel 프로젝트·도메인·기능·Invoice, Turso 데이터베이스·리전·백업·Invoice, GitHub 저장</w:t>
       </w:r>
       <w:r>
         <w:rPr>
           <w:rFonts w:ascii="맑은 고딕" w:eastAsia="맑은 고딕" w:hAnsi="맑은 고딕"/>
         </w:rPr>
-        <w:t>금</w:t>
+        <w:t>소</w:t>
       </w:r>
       <w:r>
         <w:rPr>
           <w:rFonts w:ascii="맑은 고딕" w:eastAsia="맑은 고딕" w:hAnsi="맑은 고딕" w:hint="default"/>
         </w:rPr>
-        <w:t xml:space="preserve"> 자료를 첨부한다. 비밀키와 토큰 값은 반드시 마스킹한다.</w:t>
+        <w:t xml:space="preserve"> 권한 화면을 첨부한다. 별도 IDC 계약서가 없으면 제공자명과 이용 기능이 확인되는 계정정보·청구 화면으로 대체한다. 관리자 PC와 네트워크 장비는 실제 모델·설치주소·백신·업데이트·화면잠금 자료를 첨부하며 비밀키와 토큰은 마스킹한다.</w:t>
       </w:r>
     </w:p>
     <w:p>
@@ -58562,7 +58287,7 @@
           <w:noProof/>
         </w:rPr>
         <w:drawing>
-          <wp:inline distT="0" distB="0" distL="0" distR="0" wp14:anchorId="679F7DEB" wp14:editId="16F99AF5">
+          <wp:inline distT="0" distB="0" distL="0" distR="0" wp14:anchorId="63A5D901" wp14:editId="2D03896D">
             <wp:extent cx="3610011" cy="7112000"/>
             <wp:effectExtent l="0" t="0" r="0" b="0"/>
             <wp:docPr id="1" name="그림 1"/>
@@ -58604,19 +58329,18 @@
     </w:p>
     <w:p>
       <w:pPr>
-        <w:pStyle w:val="2"/>
-        <w:spacing w:after="80" w:line="240" w:lineRule="auto"/>
-        <w:rPr>
-          <w:rFonts w:ascii="맑은 고딕" w:eastAsia="맑은 고딕" w:hAnsi="맑은 고딕" w:hint="default"/>
-          <w:sz w:val="22"/>
+        <w:rPr>
+          <w:rFonts w:hint="default"/>
+          <w:b/>
+          <w:sz w:val="36"/>
+          <w:szCs w:val="36"/>
         </w:rPr>
       </w:pPr>
       <w:r>
         <w:rPr>
-          <w:rFonts w:ascii="맑은 고딕" w:eastAsia="맑은 고딕" w:hAnsi="맑은 고딕" w:hint="default"/>
-          <w:sz w:val="22"/>
-        </w:rPr>
-        <w:t>[증빙 2] 관리자 식별 및 인증 화면</w:t>
+          <w:rFonts w:hint="default"/>
+        </w:rPr>
+        <w:br w:type="page"/>
       </w:r>
     </w:p>
     <w:p>
@@ -58624,6 +58348,23 @@
         <w:pStyle w:val="2"/>
         <w:spacing w:after="80" w:line="240" w:lineRule="auto"/>
         <w:rPr>
+          <w:rFonts w:ascii="맑은 고딕" w:eastAsia="맑은 고딕" w:hAnsi="맑은 고딕" w:hint="default"/>
+          <w:sz w:val="22"/>
+        </w:rPr>
+      </w:pPr>
+      <w:r>
+        <w:rPr>
+          <w:rFonts w:ascii="맑은 고딕" w:eastAsia="맑은 고딕" w:hAnsi="맑은 고딕" w:hint="default"/>
+          <w:sz w:val="22"/>
+        </w:rPr>
+        <w:t>[증빙 2] 관리자 식별 및 인증 화면</w:t>
+      </w:r>
+    </w:p>
+    <w:p>
+      <w:pPr>
+        <w:pStyle w:val="2"/>
+        <w:spacing w:after="80" w:line="240" w:lineRule="auto"/>
+        <w:rPr>
           <w:rFonts w:hint="default"/>
         </w:rPr>
       </w:pPr>
@@ -58633,7 +58374,7 @@
           <w:noProof/>
         </w:rPr>
         <w:drawing>
-          <wp:inline distT="0" distB="0" distL="0" distR="0" wp14:anchorId="47D8B201" wp14:editId="71F95885">
+          <wp:inline distT="0" distB="0" distL="0" distR="0" wp14:anchorId="09D238A2" wp14:editId="7D9B08BB">
             <wp:extent cx="5969000" cy="2979546"/>
             <wp:effectExtent l="0" t="0" r="0" b="0"/>
             <wp:docPr id="2" name="그림 2"/>
@@ -58675,19 +58416,18 @@
     </w:p>
     <w:p>
       <w:pPr>
-        <w:pStyle w:val="2"/>
-        <w:spacing w:after="80" w:line="240" w:lineRule="auto"/>
-        <w:rPr>
-          <w:rFonts w:ascii="맑은 고딕" w:eastAsia="맑은 고딕" w:hAnsi="맑은 고딕" w:hint="default"/>
-          <w:sz w:val="22"/>
+        <w:rPr>
+          <w:rFonts w:hint="default"/>
+          <w:b/>
+          <w:sz w:val="36"/>
+          <w:szCs w:val="36"/>
         </w:rPr>
       </w:pPr>
       <w:r>
         <w:rPr>
-          <w:rFonts w:ascii="맑은 고딕" w:eastAsia="맑은 고딕" w:hAnsi="맑은 고딕" w:hint="default"/>
-          <w:sz w:val="22"/>
-        </w:rPr>
-        <w:t>[증빙 3] 발견자 위치정보 별도 동의 화면</w:t>
+          <w:rFonts w:hint="default"/>
+        </w:rPr>
+        <w:br w:type="page"/>
       </w:r>
     </w:p>
     <w:p>
@@ -58695,6 +58435,23 @@
         <w:pStyle w:val="2"/>
         <w:spacing w:after="80" w:line="240" w:lineRule="auto"/>
         <w:rPr>
+          <w:rFonts w:ascii="맑은 고딕" w:eastAsia="맑은 고딕" w:hAnsi="맑은 고딕" w:hint="default"/>
+          <w:sz w:val="22"/>
+        </w:rPr>
+      </w:pPr>
+      <w:r>
+        <w:rPr>
+          <w:rFonts w:ascii="맑은 고딕" w:eastAsia="맑은 고딕" w:hAnsi="맑은 고딕" w:hint="default"/>
+          <w:sz w:val="22"/>
+        </w:rPr>
+        <w:t>[증빙 3] 발견자 위치정보 별도 동의 화면</w:t>
+      </w:r>
+    </w:p>
+    <w:p>
+      <w:pPr>
+        <w:pStyle w:val="2"/>
+        <w:spacing w:after="80" w:line="240" w:lineRule="auto"/>
+        <w:rPr>
           <w:rFonts w:hint="default"/>
         </w:rPr>
       </w:pPr>
@@ -58704,7 +58461,7 @@
           <w:noProof/>
         </w:rPr>
         <w:drawing>
-          <wp:inline distT="0" distB="0" distL="0" distR="0" wp14:anchorId="509B8946" wp14:editId="03E9C1B7">
+          <wp:inline distT="0" distB="0" distL="0" distR="0" wp14:anchorId="00FAD92F" wp14:editId="17242BA5">
             <wp:extent cx="5969000" cy="5095141"/>
             <wp:effectExtent l="0" t="0" r="0" b="0"/>
             <wp:docPr id="3" name="그림 3"/>
@@ -58732,6 +58489,267 @@
                     <a:xfrm>
                       <a:off x="0" y="0"/>
                       <a:ext cx="5969000" cy="5095141"/>
+                    </a:xfrm>
+                    <a:prstGeom prst="rect">
+                      <a:avLst/>
+                    </a:prstGeom>
+                  </pic:spPr>
+                </pic:pic>
+              </a:graphicData>
+            </a:graphic>
+          </wp:inline>
+        </w:drawing>
+      </w:r>
+    </w:p>
+    <w:p>
+      <w:pPr>
+        <w:rPr>
+          <w:rFonts w:hint="default"/>
+          <w:b/>
+          <w:sz w:val="36"/>
+          <w:szCs w:val="36"/>
+        </w:rPr>
+      </w:pPr>
+      <w:r>
+        <w:rPr>
+          <w:rFonts w:hint="default"/>
+        </w:rPr>
+        <w:br w:type="page"/>
+      </w:r>
+    </w:p>
+    <w:p>
+      <w:pPr>
+        <w:pStyle w:val="2"/>
+        <w:spacing w:after="80" w:line="240" w:lineRule="auto"/>
+        <w:rPr>
+          <w:rFonts w:ascii="맑은 고딕" w:eastAsia="맑은 고딕" w:hAnsi="맑은 고딕" w:hint="default"/>
+          <w:sz w:val="22"/>
+        </w:rPr>
+      </w:pPr>
+      <w:r>
+        <w:rPr>
+          <w:rFonts w:ascii="맑은 고딕" w:eastAsia="맑은 고딕" w:hAnsi="맑은 고딕" w:hint="default"/>
+          <w:sz w:val="22"/>
+        </w:rPr>
+        <w:t>[증빙 4] Vercel 프로젝트·운영배포·Function 리전 확인</w:t>
+      </w:r>
+    </w:p>
+    <w:p>
+      <w:pPr>
+        <w:pStyle w:val="2"/>
+        <w:spacing w:after="80" w:line="240" w:lineRule="auto"/>
+        <w:rPr>
+          <w:rFonts w:hint="default"/>
+        </w:rPr>
+      </w:pPr>
+      <w:r>
+        <w:rPr>
+          <w:rFonts w:hint="default"/>
+          <w:noProof/>
+        </w:rPr>
+        <w:drawing>
+          <wp:inline distT="0" distB="0" distL="0" distR="0" wp14:anchorId="3D7E712E" wp14:editId="19BAA1FF">
+            <wp:extent cx="5969000" cy="3580905"/>
+            <wp:effectExtent l="0" t="0" r="0" b="0"/>
+            <wp:docPr id="4" name="그림 4"/>
+            <wp:cNvGraphicFramePr/>
+            <a:graphic xmlns:a="http://schemas.openxmlformats.org/drawingml/2006/main">
+              <a:graphicData uri="http://schemas.openxmlformats.org/drawingml/2006/picture">
+                <pic:pic xmlns:pic="http://schemas.openxmlformats.org/drawingml/2006/picture">
+                  <pic:nvPicPr>
+                    <pic:cNvPr id="4" name=""/>
+                    <pic:cNvPicPr/>
+                  </pic:nvPicPr>
+                  <pic:blipFill>
+                    <a:blip r:embed="rId28" cstate="print">
+                      <a:extLst>
+                        <a:ext uri="{28A0092B-C50C-407E-A947-70E740481C1C}">
+                          <a14:useLocalDpi xmlns:a14="http://schemas.microsoft.com/office/drawing/2010/main" val="0"/>
+                        </a:ext>
+                      </a:extLst>
+                    </a:blip>
+                    <a:stretch>
+                      <a:fillRect/>
+                    </a:stretch>
+                  </pic:blipFill>
+                  <pic:spPr>
+                    <a:xfrm>
+                      <a:off x="0" y="0"/>
+                      <a:ext cx="5969000" cy="3580905"/>
+                    </a:xfrm>
+                    <a:prstGeom prst="rect">
+                      <a:avLst/>
+                    </a:prstGeom>
+                  </pic:spPr>
+                </pic:pic>
+              </a:graphicData>
+            </a:graphic>
+          </wp:inline>
+        </w:drawing>
+      </w:r>
+    </w:p>
+    <w:p>
+      <w:pPr>
+        <w:rPr>
+          <w:rFonts w:hint="default"/>
+          <w:b/>
+          <w:sz w:val="36"/>
+          <w:szCs w:val="36"/>
+        </w:rPr>
+      </w:pPr>
+      <w:r>
+        <w:rPr>
+          <w:rFonts w:hint="default"/>
+        </w:rPr>
+        <w:br w:type="page"/>
+      </w:r>
+    </w:p>
+    <w:p>
+      <w:pPr>
+        <w:pStyle w:val="2"/>
+        <w:spacing w:after="80" w:line="240" w:lineRule="auto"/>
+        <w:rPr>
+          <w:rFonts w:ascii="맑은 고딕" w:eastAsia="맑은 고딕" w:hAnsi="맑은 고딕" w:hint="default"/>
+          <w:sz w:val="22"/>
+        </w:rPr>
+      </w:pPr>
+      <w:r>
+        <w:rPr>
+          <w:rFonts w:ascii="맑은 고딕" w:eastAsia="맑은 고딕" w:hAnsi="맑은 고딕" w:hint="default"/>
+          <w:sz w:val="22"/>
+        </w:rPr>
+        <w:t>[증빙 5] Turso 운영 DB·리전·스키마·논리용량 확인</w:t>
+      </w:r>
+    </w:p>
+    <w:p>
+      <w:pPr>
+        <w:pStyle w:val="2"/>
+        <w:spacing w:after="80" w:line="240" w:lineRule="auto"/>
+        <w:rPr>
+          <w:rFonts w:hint="default"/>
+        </w:rPr>
+      </w:pPr>
+      <w:r>
+        <w:rPr>
+          <w:rFonts w:hint="default"/>
+          <w:noProof/>
+        </w:rPr>
+        <w:drawing>
+          <wp:inline distT="0" distB="0" distL="0" distR="0" wp14:anchorId="099995C2" wp14:editId="1DCF3C71">
+            <wp:extent cx="5969000" cy="3580905"/>
+            <wp:effectExtent l="0" t="0" r="0" b="0"/>
+            <wp:docPr id="5" name="그림 5"/>
+            <wp:cNvGraphicFramePr/>
+            <a:graphic xmlns:a="http://schemas.openxmlformats.org/drawingml/2006/main">
+              <a:graphicData uri="http://schemas.openxmlformats.org/drawingml/2006/picture">
+                <pic:pic xmlns:pic="http://schemas.openxmlformats.org/drawingml/2006/picture">
+                  <pic:nvPicPr>
+                    <pic:cNvPr id="5" name=""/>
+                    <pic:cNvPicPr/>
+                  </pic:nvPicPr>
+                  <pic:blipFill>
+                    <a:blip r:embed="rId29" cstate="print">
+                      <a:extLst>
+                        <a:ext uri="{28A0092B-C50C-407E-A947-70E740481C1C}">
+                          <a14:useLocalDpi xmlns:a14="http://schemas.microsoft.com/office/drawing/2010/main" val="0"/>
+                        </a:ext>
+                      </a:extLst>
+                    </a:blip>
+                    <a:stretch>
+                      <a:fillRect/>
+                    </a:stretch>
+                  </pic:blipFill>
+                  <pic:spPr>
+                    <a:xfrm>
+                      <a:off x="0" y="0"/>
+                      <a:ext cx="5969000" cy="3580905"/>
+                    </a:xfrm>
+                    <a:prstGeom prst="rect">
+                      <a:avLst/>
+                    </a:prstGeom>
+                  </pic:spPr>
+                </pic:pic>
+              </a:graphicData>
+            </a:graphic>
+          </wp:inline>
+        </w:drawing>
+      </w:r>
+    </w:p>
+    <w:p>
+      <w:pPr>
+        <w:rPr>
+          <w:rFonts w:hint="default"/>
+          <w:b/>
+          <w:sz w:val="36"/>
+          <w:szCs w:val="36"/>
+        </w:rPr>
+      </w:pPr>
+      <w:r>
+        <w:rPr>
+          <w:rFonts w:hint="default"/>
+        </w:rPr>
+        <w:br w:type="page"/>
+      </w:r>
+    </w:p>
+    <w:p>
+      <w:pPr>
+        <w:pStyle w:val="2"/>
+        <w:spacing w:after="80" w:line="240" w:lineRule="auto"/>
+        <w:rPr>
+          <w:rFonts w:ascii="맑은 고딕" w:eastAsia="맑은 고딕" w:hAnsi="맑은 고딕" w:hint="default"/>
+          <w:sz w:val="22"/>
+        </w:rPr>
+      </w:pPr>
+      <w:r>
+        <w:rPr>
+          <w:rFonts w:ascii="맑은 고딕" w:eastAsia="맑은 고딕" w:hAnsi="맑은 고딕" w:hint="default"/>
+          <w:sz w:val="22"/>
+        </w:rPr>
+        <w:t>[증빙 6] GitHub 저장소·운영 브랜치·배포연동 확인</w:t>
+      </w:r>
+    </w:p>
+    <w:p>
+      <w:pPr>
+        <w:pStyle w:val="2"/>
+        <w:spacing w:after="80" w:line="240" w:lineRule="auto"/>
+        <w:rPr>
+          <w:rFonts w:hint="default"/>
+        </w:rPr>
+      </w:pPr>
+      <w:r>
+        <w:rPr>
+          <w:rFonts w:hint="default"/>
+          <w:noProof/>
+        </w:rPr>
+        <w:drawing>
+          <wp:inline distT="0" distB="0" distL="0" distR="0" wp14:anchorId="4947C54C" wp14:editId="60DF1819">
+            <wp:extent cx="5969000" cy="3580905"/>
+            <wp:effectExtent l="0" t="0" r="0" b="0"/>
+            <wp:docPr id="6" name="그림 6"/>
+            <wp:cNvGraphicFramePr/>
+            <a:graphic xmlns:a="http://schemas.openxmlformats.org/drawingml/2006/main">
+              <a:graphicData uri="http://schemas.openxmlformats.org/drawingml/2006/picture">
+                <pic:pic xmlns:pic="http://schemas.openxmlformats.org/drawingml/2006/picture">
+                  <pic:nvPicPr>
+                    <pic:cNvPr id="6" name=""/>
+                    <pic:cNvPicPr/>
+                  </pic:nvPicPr>
+                  <pic:blipFill>
+                    <a:blip r:embed="rId30" cstate="print">
+                      <a:extLst>
+                        <a:ext uri="{28A0092B-C50C-407E-A947-70E740481C1C}">
+                          <a14:useLocalDpi xmlns:a14="http://schemas.microsoft.com/office/drawing/2010/main" val="0"/>
+                        </a:ext>
+                      </a:extLst>
+                    </a:blip>
+                    <a:stretch>
+                      <a:fillRect/>
+                    </a:stretch>
+                  </pic:blipFill>
+                  <pic:spPr>
+                    <a:xfrm>
+                      <a:off x="0" y="0"/>
+                      <a:ext cx="5969000" cy="3580905"/>
                     </a:xfrm>
                     <a:prstGeom prst="rect">
                       <a:avLst/>

</xml_diff>